<commit_message>
UML and justification added
UML diagram dictating classes and behaviour has been added to GIT path, as well as the justification of certain design aspects to the design document
</commit_message>
<xml_diff>
--- a/Dead Man.docx
+++ b/Dead Man.docx
@@ -19,12 +19,125 @@
       </w:r>
     </w:p>
     <w:p>
-      <w:r>
-        <w:br/>
+      <w:pPr>
+        <w:pStyle w:val="Heading1"/>
+      </w:pPr>
+      <w:r>
+        <w:t>UML Diagram</w:t>
+      </w:r>
+    </w:p>
+    <w:p>
+      <w:pPr>
+        <w:pStyle w:val="ListParagraph"/>
+        <w:numPr>
+          <w:ilvl w:val="0"/>
+          <w:numId w:val="1"/>
+        </w:numPr>
+      </w:pPr>
+      <w:r>
+        <w:t xml:space="preserve">Card parent class features only the abstract function </w:t>
+      </w:r>
+      <w:r>
+        <w:rPr>
+          <w:i/>
+          <w:iCs/>
+        </w:rPr>
+        <w:t>play</w:t>
+      </w:r>
+      <w:r>
+        <w:t xml:space="preserve"> as other functions will have static behaviour, whereas the </w:t>
+      </w:r>
+      <w:r>
+        <w:rPr>
+          <w:i/>
+          <w:iCs/>
+        </w:rPr>
+        <w:t>play</w:t>
+      </w:r>
+      <w:r>
+        <w:t xml:space="preserve"> function will vary between card types.</w:t>
+      </w:r>
+    </w:p>
+    <w:p>
+      <w:pPr>
+        <w:pStyle w:val="ListParagraph"/>
+        <w:numPr>
+          <w:ilvl w:val="0"/>
+          <w:numId w:val="1"/>
+        </w:numPr>
+      </w:pPr>
+      <w:proofErr w:type="spellStart"/>
+      <w:r>
+        <w:rPr>
+          <w:i/>
+          <w:iCs/>
+        </w:rPr>
+        <w:t>displayPlayerBank</w:t>
+      </w:r>
+      <w:proofErr w:type="spellEnd"/>
+      <w:r>
+        <w:t xml:space="preserve"> function in Player will display both the player’s name and bank.</w:t>
+      </w:r>
+    </w:p>
+    <w:p>
+      <w:pPr>
+        <w:pStyle w:val="ListParagraph"/>
+        <w:numPr>
+          <w:ilvl w:val="0"/>
+          <w:numId w:val="1"/>
+        </w:numPr>
+      </w:pPr>
+      <w:r>
+        <w:t xml:space="preserve">Game </w:t>
+      </w:r>
+      <w:r>
+        <w:t xml:space="preserve">does not feature functions to initialise a deck or players as these are constants to the start of the game and will instead be initialised within the </w:t>
+      </w:r>
+      <w:proofErr w:type="spellStart"/>
+      <w:r>
+        <w:rPr>
+          <w:i/>
+          <w:iCs/>
+        </w:rPr>
+        <w:t>init</w:t>
+      </w:r>
+      <w:proofErr w:type="spellEnd"/>
+      <w:r>
+        <w:t xml:space="preserve"> </w:t>
+      </w:r>
+      <w:proofErr w:type="gramStart"/>
+      <w:r>
+        <w:t>function;</w:t>
+      </w:r>
+      <w:proofErr w:type="gramEnd"/>
+      <w:r>
+        <w:t xml:space="preserve"> as is the game.</w:t>
+      </w:r>
+    </w:p>
+    <w:p>
+      <w:pPr>
+        <w:pStyle w:val="ListParagraph"/>
+        <w:numPr>
+          <w:ilvl w:val="0"/>
+          <w:numId w:val="1"/>
+        </w:numPr>
+      </w:pPr>
+      <w:r>
+        <w:t xml:space="preserve">Game does not feature individual actions within a turn, as these too are constant and can be placed after one another in one </w:t>
+      </w:r>
+      <w:r>
+        <w:rPr>
+          <w:i/>
+          <w:iCs/>
+        </w:rPr>
+        <w:t xml:space="preserve">turn </w:t>
+      </w:r>
+      <w:r>
+        <w:t>function.</w:t>
       </w:r>
     </w:p>
     <w:sectPr>
-      <w:headerReference w:type="default" r:id="rId6"/>
+      <w:headerReference w:type="default" r:id="rId7"/>
       <w:pgSz w:w="11906" w:h="16838"/>
       <w:pgMar w:top="1440" w:right="1440" w:bottom="1440" w:left="1440" w:header="708" w:footer="708" w:gutter="0"/>
       <w:cols w:space="708"/>
@@ -102,6 +215,127 @@
     </w:r>
   </w:p>
 </w:hdr>
+</file>
+
+<file path=word/numbering.xml><?xml version="1.0" encoding="utf-8"?>
+<w:numbering xmlns:wpc="http://schemas.microsoft.com/office/word/2010/wordprocessingCanvas" xmlns:cx="http://schemas.microsoft.com/office/drawing/2014/chartex" xmlns:cx1="http://schemas.microsoft.com/office/drawing/2015/9/8/chartex" xmlns:cx2="http://schemas.microsoft.com/office/drawing/2015/10/21/chartex" xmlns:cx3="http://schemas.microsoft.com/office/drawing/2016/5/9/chartex" xmlns:cx4="http://schemas.microsoft.com/office/drawing/2016/5/10/chartex" xmlns:cx5="http://schemas.microsoft.com/office/drawing/2016/5/11/chartex" xmlns:cx6="http://schemas.microsoft.com/office/drawing/2016/5/12/chartex" xmlns:cx7="http://schemas.microsoft.com/office/drawing/2016/5/13/chartex" xmlns:cx8="http://schemas.microsoft.com/office/drawing/2016/5/14/chartex" xmlns:mc="http://schemas.openxmlformats.org/markup-compatibility/2006" xmlns:aink="http://schemas.microsoft.com/office/drawing/2016/ink" xmlns:am3d="http://schemas.microsoft.com/office/drawing/2017/model3d" xmlns:o="urn:schemas-microsoft-com:office:office" xmlns:oel="http://schemas.microsoft.com/office/2019/extlst" xmlns:r="http://schemas.openxmlformats.org/officeDocument/2006/relationships" xmlns:m="http://schemas.openxmlformats.org/officeDocument/2006/math" xmlns:v="urn:schemas-microsoft-com:vml" xmlns:wp14="http://schemas.microsoft.com/office/word/2010/wordprocessingDrawing" xmlns:wp="http://schemas.openxmlformats.org/drawingml/2006/wordprocessingDrawing" xmlns:w10="urn:schemas-microsoft-com:office:word" xmlns:w="http://schemas.openxmlformats.org/wordprocessingml/2006/main" xmlns:w14="http://schemas.microsoft.com/office/word/2010/wordml" xmlns:w15="http://schemas.microsoft.com/office/word/2012/wordml" xmlns:w16cex="http://schemas.microsoft.com/office/word/2018/wordml/cex" xmlns:w16cid="http://schemas.microsoft.com/office/word/2016/wordml/cid" xmlns:w16="http://schemas.microsoft.com/office/word/2018/wordml" xmlns:w16du="http://schemas.microsoft.com/office/word/2023/wordml/word16du" xmlns:w16sdtdh="http://schemas.microsoft.com/office/word/2020/wordml/sdtdatahash" xmlns:w16sdtfl="http://schemas.microsoft.com/office/word/2024/wordml/sdtformatlock" xmlns:w16se="http://schemas.microsoft.com/office/word/2015/wordml/symex" xmlns:wpg="http://schemas.microsoft.com/office/word/2010/wordprocessingGroup" xmlns:wpi="http://schemas.microsoft.com/office/word/2010/wordprocessingInk" xmlns:wne="http://schemas.microsoft.com/office/word/2006/wordml" xmlns:wps="http://schemas.microsoft.com/office/word/2010/wordprocessingShape" mc:Ignorable="w14 w15 w16se w16cid w16 w16cex w16sdtdh w16sdtfl w16du wp14">
+  <w:abstractNum w:abstractNumId="0" w15:restartNumberingAfterBreak="0">
+    <w:nsid w:val="0E4E7998"/>
+    <w:multiLevelType w:val="hybridMultilevel"/>
+    <w:tmpl w:val="0DCEF282"/>
+    <w:lvl w:ilvl="0" w:tplc="0C090001">
+      <w:start w:val="1"/>
+      <w:numFmt w:val="bullet"/>
+      <w:lvlText w:val=""/>
+      <w:lvlJc w:val="left"/>
+      <w:pPr>
+        <w:ind w:left="720" w:hanging="360"/>
+      </w:pPr>
+      <w:rPr>
+        <w:rFonts w:ascii="Symbol" w:hAnsi="Symbol" w:hint="default"/>
+      </w:rPr>
+    </w:lvl>
+    <w:lvl w:ilvl="1" w:tplc="0C090003" w:tentative="1">
+      <w:start w:val="1"/>
+      <w:numFmt w:val="bullet"/>
+      <w:lvlText w:val="o"/>
+      <w:lvlJc w:val="left"/>
+      <w:pPr>
+        <w:ind w:left="1440" w:hanging="360"/>
+      </w:pPr>
+      <w:rPr>
+        <w:rFonts w:ascii="Courier New" w:hAnsi="Courier New" w:cs="Courier New" w:hint="default"/>
+      </w:rPr>
+    </w:lvl>
+    <w:lvl w:ilvl="2" w:tplc="0C090005" w:tentative="1">
+      <w:start w:val="1"/>
+      <w:numFmt w:val="bullet"/>
+      <w:lvlText w:val=""/>
+      <w:lvlJc w:val="left"/>
+      <w:pPr>
+        <w:ind w:left="2160" w:hanging="360"/>
+      </w:pPr>
+      <w:rPr>
+        <w:rFonts w:ascii="Wingdings" w:hAnsi="Wingdings" w:hint="default"/>
+      </w:rPr>
+    </w:lvl>
+    <w:lvl w:ilvl="3" w:tplc="0C090001" w:tentative="1">
+      <w:start w:val="1"/>
+      <w:numFmt w:val="bullet"/>
+      <w:lvlText w:val=""/>
+      <w:lvlJc w:val="left"/>
+      <w:pPr>
+        <w:ind w:left="2880" w:hanging="360"/>
+      </w:pPr>
+      <w:rPr>
+        <w:rFonts w:ascii="Symbol" w:hAnsi="Symbol" w:hint="default"/>
+      </w:rPr>
+    </w:lvl>
+    <w:lvl w:ilvl="4" w:tplc="0C090003" w:tentative="1">
+      <w:start w:val="1"/>
+      <w:numFmt w:val="bullet"/>
+      <w:lvlText w:val="o"/>
+      <w:lvlJc w:val="left"/>
+      <w:pPr>
+        <w:ind w:left="3600" w:hanging="360"/>
+      </w:pPr>
+      <w:rPr>
+        <w:rFonts w:ascii="Courier New" w:hAnsi="Courier New" w:cs="Courier New" w:hint="default"/>
+      </w:rPr>
+    </w:lvl>
+    <w:lvl w:ilvl="5" w:tplc="0C090005" w:tentative="1">
+      <w:start w:val="1"/>
+      <w:numFmt w:val="bullet"/>
+      <w:lvlText w:val=""/>
+      <w:lvlJc w:val="left"/>
+      <w:pPr>
+        <w:ind w:left="4320" w:hanging="360"/>
+      </w:pPr>
+      <w:rPr>
+        <w:rFonts w:ascii="Wingdings" w:hAnsi="Wingdings" w:hint="default"/>
+      </w:rPr>
+    </w:lvl>
+    <w:lvl w:ilvl="6" w:tplc="0C090001" w:tentative="1">
+      <w:start w:val="1"/>
+      <w:numFmt w:val="bullet"/>
+      <w:lvlText w:val=""/>
+      <w:lvlJc w:val="left"/>
+      <w:pPr>
+        <w:ind w:left="5040" w:hanging="360"/>
+      </w:pPr>
+      <w:rPr>
+        <w:rFonts w:ascii="Symbol" w:hAnsi="Symbol" w:hint="default"/>
+      </w:rPr>
+    </w:lvl>
+    <w:lvl w:ilvl="7" w:tplc="0C090003" w:tentative="1">
+      <w:start w:val="1"/>
+      <w:numFmt w:val="bullet"/>
+      <w:lvlText w:val="o"/>
+      <w:lvlJc w:val="left"/>
+      <w:pPr>
+        <w:ind w:left="5760" w:hanging="360"/>
+      </w:pPr>
+      <w:rPr>
+        <w:rFonts w:ascii="Courier New" w:hAnsi="Courier New" w:cs="Courier New" w:hint="default"/>
+      </w:rPr>
+    </w:lvl>
+    <w:lvl w:ilvl="8" w:tplc="0C090005" w:tentative="1">
+      <w:start w:val="1"/>
+      <w:numFmt w:val="bullet"/>
+      <w:lvlText w:val=""/>
+      <w:lvlJc w:val="left"/>
+      <w:pPr>
+        <w:ind w:left="6480" w:hanging="360"/>
+      </w:pPr>
+      <w:rPr>
+        <w:rFonts w:ascii="Wingdings" w:hAnsi="Wingdings" w:hint="default"/>
+      </w:rPr>
+    </w:lvl>
+  </w:abstractNum>
+  <w:num w:numId="1" w16cid:durableId="406731186">
+    <w:abstractNumId w:val="0"/>
+  </w:num>
+</w:numbering>
 </file>
 
 <file path=word/styles.xml><?xml version="1.0" encoding="utf-8"?>
@@ -707,7 +941,6 @@
   <w:style w:type="character" w:default="1" w:styleId="DefaultParagraphFont">
     <w:name w:val="Default Paragraph Font"/>
     <w:uiPriority w:val="1"/>
-    <w:semiHidden/>
     <w:unhideWhenUsed/>
   </w:style>
   <w:style w:type="table" w:default="1" w:styleId="TableNormal">

</xml_diff>

<commit_message>
Commented and added design justifications to document
</commit_message>
<xml_diff>
--- a/Dead Man.docx
+++ b/Dead Man.docx
@@ -27,6 +27,54 @@
       </w:r>
     </w:p>
     <w:p>
+      <w:r>
+        <w:rPr>
+          <w:noProof/>
+        </w:rPr>
+        <w:drawing>
+          <wp:inline distT="0" distB="0" distL="0" distR="0" wp14:anchorId="3497B5D8" wp14:editId="5F931971">
+            <wp:extent cx="5731510" cy="6027420"/>
+            <wp:effectExtent l="0" t="0" r="2540" b="0"/>
+            <wp:docPr id="1083148302" name="Picture 1"/>
+            <wp:cNvGraphicFramePr>
+              <a:graphicFrameLocks xmlns:a="http://schemas.openxmlformats.org/drawingml/2006/main" noChangeAspect="1"/>
+            </wp:cNvGraphicFramePr>
+            <a:graphic xmlns:a="http://schemas.openxmlformats.org/drawingml/2006/main">
+              <a:graphicData uri="http://schemas.openxmlformats.org/drawingml/2006/picture">
+                <pic:pic xmlns:pic="http://schemas.openxmlformats.org/drawingml/2006/picture">
+                  <pic:nvPicPr>
+                    <pic:cNvPr id="1083148302" name="Picture 1083148302"/>
+                    <pic:cNvPicPr/>
+                  </pic:nvPicPr>
+                  <pic:blipFill>
+                    <a:blip r:embed="rId7">
+                      <a:extLst>
+                        <a:ext uri="{28A0092B-C50C-407E-A947-70E740481C1C}">
+                          <a14:useLocalDpi xmlns:a14="http://schemas.microsoft.com/office/drawing/2010/main" val="0"/>
+                        </a:ext>
+                      </a:extLst>
+                    </a:blip>
+                    <a:stretch>
+                      <a:fillRect/>
+                    </a:stretch>
+                  </pic:blipFill>
+                  <pic:spPr>
+                    <a:xfrm>
+                      <a:off x="0" y="0"/>
+                      <a:ext cx="5731510" cy="6027420"/>
+                    </a:xfrm>
+                    <a:prstGeom prst="rect">
+                      <a:avLst/>
+                    </a:prstGeom>
+                  </pic:spPr>
+                </pic:pic>
+              </a:graphicData>
+            </a:graphic>
+          </wp:inline>
+        </w:drawing>
+      </w:r>
+    </w:p>
+    <w:p>
       <w:pPr>
         <w:pStyle w:val="ListParagraph"/>
         <w:numPr>
@@ -66,7 +114,6 @@
           <w:numId w:val="1"/>
         </w:numPr>
       </w:pPr>
-      <w:proofErr w:type="spellStart"/>
       <w:r>
         <w:rPr>
           <w:i/>
@@ -74,7 +121,6 @@
         </w:rPr>
         <w:t>displayPlayerBank</w:t>
       </w:r>
-      <w:proofErr w:type="spellEnd"/>
       <w:r>
         <w:t xml:space="preserve"> function in Player will display both the player’s name and bank.</w:t>
       </w:r>
@@ -93,25 +139,11 @@
       <w:r>
         <w:t xml:space="preserve">does not feature functions to initialise a deck or players as these are constants to the start of the game and will instead be initialised within the </w:t>
       </w:r>
-      <w:proofErr w:type="spellStart"/>
-      <w:r>
-        <w:rPr>
-          <w:i/>
-          <w:iCs/>
-        </w:rPr>
-        <w:t>init</w:t>
-      </w:r>
-      <w:proofErr w:type="spellEnd"/>
-      <w:r>
-        <w:t xml:space="preserve"> </w:t>
-      </w:r>
-      <w:proofErr w:type="gramStart"/>
-      <w:r>
-        <w:t>function;</w:t>
-      </w:r>
-      <w:proofErr w:type="gramEnd"/>
-      <w:r>
-        <w:t xml:space="preserve"> as is the game.</w:t>
+      <w:r>
+        <w:t>Game constructor</w:t>
+      </w:r>
+      <w:r>
+        <w:t>; as is the game.</w:t>
       </w:r>
     </w:p>
     <w:p>
@@ -123,6 +155,7 @@
         </w:numPr>
       </w:pPr>
       <w:r>
+        <w:lastRenderedPageBreak/>
         <w:t xml:space="preserve">Game does not feature individual actions within a turn, as these too are constant and can be placed after one another in one </w:t>
       </w:r>
       <w:r>
@@ -136,8 +169,44 @@
         <w:t>function.</w:t>
       </w:r>
     </w:p>
+    <w:p>
+      <w:pPr>
+        <w:pStyle w:val="ListParagraph"/>
+        <w:numPr>
+          <w:ilvl w:val="0"/>
+          <w:numId w:val="1"/>
+        </w:numPr>
+      </w:pPr>
+      <w:r>
+        <w:t>grabFromBank function in Card created to reduce redundancy of selecting high value cards from a player bank, as is seen in Sword, Cannon, and Hook</w:t>
+      </w:r>
+    </w:p>
+    <w:p>
+      <w:pPr>
+        <w:pStyle w:val="ListParagraph"/>
+        <w:numPr>
+          <w:ilvl w:val="0"/>
+          <w:numId w:val="1"/>
+        </w:numPr>
+      </w:pPr>
+      <w:r>
+        <w:t>Key overwrites empty willAddToBank function as this is the only card that has its ability activate on banking</w:t>
+      </w:r>
+    </w:p>
+    <w:p>
+      <w:pPr>
+        <w:pStyle w:val="ListParagraph"/>
+        <w:numPr>
+          <w:ilvl w:val="0"/>
+          <w:numId w:val="1"/>
+        </w:numPr>
+      </w:pPr>
+      <w:r>
+        <w:t>Card _typeString variable creates string form of child’s type to be used in toString()</w:t>
+      </w:r>
+    </w:p>
     <w:sectPr>
-      <w:headerReference w:type="default" r:id="rId7"/>
+      <w:headerReference w:type="default" r:id="rId8"/>
       <w:pgSz w:w="11906" w:h="16838"/>
       <w:pgMar w:top="1440" w:right="1440" w:bottom="1440" w:left="1440" w:header="708" w:footer="708" w:gutter="0"/>
       <w:cols w:space="708"/>
@@ -941,6 +1010,7 @@
   <w:style w:type="character" w:default="1" w:styleId="DefaultParagraphFont">
     <w:name w:val="Default Paragraph Font"/>
     <w:uiPriority w:val="1"/>
+    <w:semiHidden/>
     <w:unhideWhenUsed/>
   </w:style>
   <w:style w:type="table" w:default="1" w:styleId="TableNormal">

</xml_diff>